<commit_message>
Update trainer and admin guides (EN/FR)
Guide edits saved on 2 July 2026 alongside the v0.3.9 work.

Co-Authored-By: Claude Opus 5.5 <noreply@anthropic.com>
Claude-Session: https://claude.ai/code/session_01CMPS8Hgsnj1uYkD29XF28B
</commit_message>
<xml_diff>
--- a/docs/Admin-Guide-EN.docx
+++ b/docs/Admin-Guide-EN.docx
@@ -46,7 +46,7 @@
           <w:sz w:val="24"/>
           <w:szCs w:val="24"/>
         </w:rPr>
-        <w:t xml:space="preserve">Ubuntu 3.0 admin console — cohorts, courses, staff, Moodle, audit, demo data, donor portal</w:t>
+        <w:t xml:space="preserve">Ubuntu 3.0 admin console — academic years, courses, staff, Moodle, audit, demo data, donor portal</w:t>
       </w:r>
     </w:p>
     <w:p>
@@ -74,7 +74,7 @@
           <w:sz w:val="22"/>
           <w:szCs w:val="22"/>
         </w:rPr>
-        <w:t xml:space="preserve">Version: v0.3.8 (June 2026)</w:t>
+        <w:t xml:space="preserve">Version: v0.3.9 (July 2026)</w:t>
       </w:r>
     </w:p>
     <w:p>
@@ -121,7 +121,7 @@
         <w:spacing w:after="60"/>
       </w:pPr>
       <w:r>
-        <w:t xml:space="preserve">Create and manage cohorts, courses, and their facilitators.</w:t>
+        <w:t xml:space="preserve">Create and manage academic years, courses, and their facilitators.</w:t>
       </w:r>
     </w:p>
     <w:p>
@@ -309,15 +309,15 @@
         <w:pStyle w:val="Heading1"/>
       </w:pPr>
       <w:r>
-        <w:t xml:space="preserve">2. Cohorts</w:t>
-      </w:r>
-    </w:p>
-    <w:p>
-      <w:pPr>
-        <w:spacing w:after="120"/>
-      </w:pPr>
-      <w:r>
-        <w:t xml:space="preserve">A cohort is a time-bound batch of courses — e.g. 'MAHAMA 2025'. Every course belongs to a cohort.</w:t>
+        <w:t xml:space="preserve">2. Academic years</w:t>
+      </w:r>
+    </w:p>
+    <w:p>
+      <w:pPr>
+        <w:spacing w:after="120"/>
+      </w:pPr>
+      <w:r>
+        <w:t xml:space="preserve">An academic year is a time-bound batch of courses — e.g. 'MAHAMA 2025'. Every course belongs to an academic year.</w:t>
       </w:r>
     </w:p>
     <w:p>
@@ -325,20 +325,20 @@
         <w:pStyle w:val="Heading2"/>
       </w:pPr>
       <w:r>
-        <w:t xml:space="preserve">Create a cohort</w:t>
-      </w:r>
-    </w:p>
-    <w:p>
-      <w:pPr>
-        <w:pStyle w:val="ListParagraph"/>
-        <w:numPr>
-          <w:ilvl w:val="0"/>
-          <w:numId w:val="1"/>
-        </w:numPr>
-        <w:spacing w:after="60"/>
-      </w:pPr>
-      <w:r>
-        <w:t xml:space="preserve">Sidebar → Cohorts → '+ New cohort'.</w:t>
+        <w:t xml:space="preserve">Create an academic year</w:t>
+      </w:r>
+    </w:p>
+    <w:p>
+      <w:pPr>
+        <w:pStyle w:val="ListParagraph"/>
+        <w:numPr>
+          <w:ilvl w:val="0"/>
+          <w:numId w:val="1"/>
+        </w:numPr>
+        <w:spacing w:after="60"/>
+      </w:pPr>
+      <w:r>
+        <w:t xml:space="preserve">Sidebar → Academic years → '+ New academic year'.</w:t>
       </w:r>
     </w:p>
     <w:p>
@@ -430,7 +430,7 @@
           </w:p>
           <w:p>
             <w:r>
-              <w:t xml:space="preserve">When you delete a cohort, its courses, sessions and participants stay — only the link to the cohort goes away. No history is lost, and the sync ensures every device drops the link on its next pull.</w:t>
+              <w:t xml:space="preserve">When you delete an academic year, its courses, sessions and participants stay — only the link to the academic year goes away. No history is lost, and the sync ensures every device drops the link on its next pull.</w:t>
             </w:r>
           </w:p>
         </w:tc>
@@ -454,7 +454,7 @@
         <w:spacing w:after="120"/>
       </w:pPr>
       <w:r>
-        <w:t xml:space="preserve">A course is a training run by one or more staff members inside a cohort. The Courses table shows the thumbnail (Moodle banner if linked), name, cohort, facilitators, and an updated-at column.</w:t>
+        <w:t xml:space="preserve">A course is a training run by one or more staff members inside an academic year. The Courses table shows the thumbnail (Moodle banner if linked), name, academic year, facilitators, and an updated-at column.</w:t>
       </w:r>
     </w:p>
     <w:p>
@@ -488,7 +488,7 @@
         <w:spacing w:after="60"/>
       </w:pPr>
       <w:r>
-        <w:t xml:space="preserve">Pick a cohort (required).</w:t>
+        <w:t xml:space="preserve">Pick an academic year (required).</w:t>
       </w:r>
     </w:p>
     <w:p>
@@ -675,6 +675,14 @@
       </w:pPr>
       <w:r>
         <w:t xml:space="preserve">'Reactivate' (on already-dropped rows) puts them back. After reactivation, a 'Delete anyway' option appears in the PWA for cases where you really need to wipe the row and its history.</w:t>
+      </w:r>
+    </w:p>
+    <w:p>
+      <w:pPr>
+        <w:spacing w:after="120"/>
+      </w:pPr>
+      <w:r>
+        <w:t xml:space="preserve">New in v0.3.9: participants can carry a profile photo, captured in the PWA participant form. The bytes live on the server under /opt/ubuntu3/server/storage/participants/ and are served by /api/participants/{id}/media/photo. Avatars show in the PWA rosters and pickers; the admin console tables are unchanged.</w:t>
       </w:r>
     </w:p>
     <w:p>
@@ -1013,6 +1021,14 @@
     </w:p>
     <w:p>
       <w:pPr>
+        <w:spacing w:after="120"/>
+      </w:pPr>
+      <w:r>
+        <w:t xml:space="preserve">New in v0.3.9: every account (staff and trainee) can carry a profile photo (users.has_photo). Each person sets their own in the PWA under More → Profile; admins can manage anyone's via /api/users/{id}/media/photo. Files live under /opt/ubuntu3/server/storage/users/. Avatars appear in the facilitator picker and the participant picker.</w:t>
+      </w:r>
+    </w:p>
+    <w:p>
+      <w:pPr>
         <w:pStyle w:val="Heading1"/>
       </w:pPr>
       <w:r>
@@ -1024,7 +1040,7 @@
         <w:spacing w:after="120"/>
       </w:pPr>
       <w:r>
-        <w:t xml:space="preserve">Sidebar → Audit log. Shows 'who edited what, when' across cohorts, courses, sessions, participants, and stories. Derived from the existing author_id + server_updated_at / created_at / deleted_at columns — no extra schema.</w:t>
+        <w:t xml:space="preserve">Sidebar → Audit log. Shows 'who edited what, when' across academic years, courses, sessions, participants, and stories. Derived from the existing author_id + server_updated_at / created_at / deleted_at columns — no extra schema.</w:t>
       </w:r>
     </w:p>
     <w:p>
@@ -1045,7 +1061,7 @@
         <w:spacing w:after="60"/>
       </w:pPr>
       <w:r>
-        <w:t xml:space="preserve">Entity — cohorts / courses / sessions / participants / stories.</w:t>
+        <w:t xml:space="preserve">Entity — academic years / courses / sessions / participants / stories.</w:t>
       </w:r>
     </w:p>
     <w:p>
@@ -1166,7 +1182,7 @@
         <w:spacing w:after="120"/>
       </w:pPr>
       <w:r>
-        <w:t xml:space="preserve">On the admin Dashboard, near the bottom, the 'Sample data (trainer training)' card lets you create a self-contained DEMO cohort full of fake but realistic data so new trainers can practice in the PWA without touching the real M&amp;E corpus.</w:t>
+        <w:t xml:space="preserve">On the admin Dashboard, near the bottom, the 'Sample data (trainer training)' card lets you create a self-contained DEMO academic year full of fake but realistic data so new trainers can practice in the PWA without touching the real M&amp;E corpus.</w:t>
       </w:r>
     </w:p>
     <w:p>
@@ -1182,20 +1198,20 @@
         <w:spacing w:after="120"/>
       </w:pPr>
       <w:r>
-        <w:t xml:space="preserve">Click 'Create demo cohort'. The server seeds, in one transaction:</w:t>
-      </w:r>
-    </w:p>
-    <w:p>
-      <w:pPr>
-        <w:pStyle w:val="ListParagraph"/>
-        <w:numPr>
-          <w:ilvl w:val="0"/>
-          <w:numId w:val="2"/>
-        </w:numPr>
-        <w:spacing w:after="60"/>
-      </w:pPr>
-      <w:r>
-        <w:t xml:space="preserve">1 cohort named 'DEMO — Sandbox cohort' (region 'Demo region').</w:t>
+        <w:t xml:space="preserve">Click 'Create demo academic year'. The server seeds, in one transaction:</w:t>
+      </w:r>
+    </w:p>
+    <w:p>
+      <w:pPr>
+        <w:pStyle w:val="ListParagraph"/>
+        <w:numPr>
+          <w:ilvl w:val="0"/>
+          <w:numId w:val="2"/>
+        </w:numPr>
+        <w:spacing w:after="60"/>
+      </w:pPr>
+      <w:r>
+        <w:t xml:space="preserve">1 academic year named 'DEMO — Sandbox cohort' (region 'Demo region').</w:t>
       </w:r>
     </w:p>
     <w:p>
@@ -1268,7 +1284,7 @@
         <w:spacing w:after="120"/>
       </w:pPr>
       <w:r>
-        <w:t xml:space="preserve">The demo data syncs down to every trainer device on next pull. Two clicks are safe — the create endpoint is idempotent and returns the existing summary if a DEMO cohort is already present.</w:t>
+        <w:t xml:space="preserve">The demo data syncs down to every trainer device on next pull. Two clicks are safe — the create endpoint is idempotent and returns the existing summary if a DEMO academic year is already present.</w:t>
       </w:r>
     </w:p>
     <w:p>
@@ -1284,7 +1300,7 @@
         <w:spacing w:after="120"/>
       </w:pPr>
       <w:r>
-        <w:t xml:space="preserve">When the training is over, click 'Remove demo data'. The endpoint tombstones the whole subtree (attendance → stories → sessions → participants → courses → cohort) in a single transaction. Every device drops the rows on next sync.</w:t>
+        <w:t xml:space="preserve">When the training is over, click 'Remove demo data'. The endpoint tombstones the whole subtree (attendance → stories → sessions → participants → courses → academic year) in a single transaction. Every device drops the rows on next sync.</w:t>
       </w:r>
     </w:p>
     <w:tbl>
@@ -1334,7 +1350,7 @@
           </w:p>
           <w:p>
             <w:r>
-              <w:t xml:space="preserve">The demo tree is anchored entirely on the cohort name prefix 'DEMO — '. Don't rename it from the database directly — the cleanup endpoint and the donor portal exclude filter both stop recognising it. Edit it from the admin UI instead.</w:t>
+              <w:t xml:space="preserve">The demo tree is anchored entirely on the academic year name prefix 'DEMO — '. Don't rename it from the database directly — the cleanup endpoint and the donor portal exclude filter both stop recognising it. Edit it from the admin UI instead.</w:t>
             </w:r>
           </w:p>
         </w:tc>
@@ -1384,15 +1400,15 @@
         <w:spacing w:after="60"/>
       </w:pPr>
       <w:r>
-        <w:t xml:space="preserve">Cohort (optional — leave blank for all).</w:t>
-      </w:r>
-    </w:p>
-    <w:p>
-      <w:pPr>
-        <w:spacing w:after="120"/>
-      </w:pPr>
-      <w:r>
-        <w:t xml:space="preserve">The result page renders headline KPIs (attendance %, sessions delivered, participants, stories with consent), demographics by sex and age, per-cohort breakdown, attendance trend by month, and a card per selected story with text, photo and attribution. Use the browser's Print → Save as PDF to produce the document.</w:t>
+        <w:t xml:space="preserve">Academic year (optional — leave blank for all).</w:t>
+      </w:r>
+    </w:p>
+    <w:p>
+      <w:pPr>
+        <w:spacing w:after="120"/>
+      </w:pPr>
+      <w:r>
+        <w:t xml:space="preserve">The result page renders headline KPIs (attendance %, sessions delivered, participants, stories with consent), demographics by sex and age, per-academic-year breakdown, attendance trend by month, and a card per selected story with text, photo and attribution. Use the browser's Print → Save as PDF to produce the document.</w:t>
       </w:r>
     </w:p>
     <w:p>
@@ -1421,7 +1437,7 @@
         <w:spacing w:after="60"/>
       </w:pPr>
       <w:r>
-        <w:t xml:space="preserve">Active cohorts (had a session in the last 90 days), total cohorts, courses, participants, sessions (all-time + last 30 days), stories with consent.</w:t>
+        <w:t xml:space="preserve">Active academic years (had a session in the last 90 days), total academic years, courses, participants, sessions (all-time + last 30 days), stories with consent.</w:t>
       </w:r>
     </w:p>
     <w:p>
@@ -1473,7 +1489,7 @@
         <w:spacing w:after="60"/>
       </w:pPr>
       <w:r>
-        <w:t xml:space="preserve">Reach by region (cohorts + participants per region).</w:t>
+        <w:t xml:space="preserve">Reach by region (academic years + participants per region).</w:t>
       </w:r>
     </w:p>
     <w:p>
@@ -1494,7 +1510,7 @@
         <w:spacing w:after="120"/>
       </w:pPr>
       <w:r>
-        <w:t xml:space="preserve">The DEMO cohort and all soft-deleted rows are excluded by a single server-side filter. No PII is ever exposed.</w:t>
+        <w:t xml:space="preserve">The DEMO academic year and all soft-deleted rows are excluded by a single server-side filter. No PII is ever exposed.</w:t>
       </w:r>
     </w:p>
     <w:tbl>
@@ -1975,6 +1991,121 @@
       <w:pPr>
         <w:spacing w:after="80"/>
       </w:pPr>
+    </w:p>
+    <w:p>
+      <w:pPr>
+        <w:pStyle w:val="Heading1"/>
+      </w:pPr>
+      <w:r>
+        <w:t xml:space="preserve">New in v0.3.9 — what changed and how to deploy</w:t>
+      </w:r>
+    </w:p>
+    <w:p>
+      <w:pPr>
+        <w:pStyle w:val="ListParagraph"/>
+        <w:numPr>
+          <w:ilvl w:val="0"/>
+          <w:numId w:val="2"/>
+        </w:numPr>
+        <w:spacing w:after="60"/>
+      </w:pPr>
+      <w:r>
+        <w:t xml:space="preserve">'Cohorts' are now called 'Academic years' everywhere — PWA (all three languages) and admin console. Labels only; the data model, API, and CSV column ids are untouched.</w:t>
+      </w:r>
+    </w:p>
+    <w:p>
+      <w:pPr>
+        <w:pStyle w:val="ListParagraph"/>
+        <w:numPr>
+          <w:ilvl w:val="0"/>
+          <w:numId w:val="2"/>
+        </w:numPr>
+        <w:spacing w:after="60"/>
+      </w:pPr>
+      <w:r>
+        <w:t xml:space="preserve">Offline reliability: the PWA no longer trusts the browser's online flag. It simply attempts the sync, and also syncs every time it returns to the foreground. Records captured offline now reliably reach the server.</w:t>
+      </w:r>
+    </w:p>
+    <w:p>
+      <w:pPr>
+        <w:pStyle w:val="ListParagraph"/>
+        <w:numPr>
+          <w:ilvl w:val="0"/>
+          <w:numId w:val="2"/>
+        </w:numPr>
+        <w:spacing w:after="60"/>
+      </w:pPr>
+      <w:r>
+        <w:t xml:space="preserve">Every session page lists its linked stories, with a search bar and a "+" circle that pre-links a new story to the session.</w:t>
+      </w:r>
+    </w:p>
+    <w:p>
+      <w:pPr>
+        <w:pStyle w:val="ListParagraph"/>
+        <w:numPr>
+          <w:ilvl w:val="0"/>
+          <w:numId w:val="2"/>
+        </w:numPr>
+        <w:spacing w:after="60"/>
+      </w:pPr>
+      <w:r>
+        <w:t xml:space="preserve">Creating a course, session, or story returns to the list it came from (newest on top) instead of jumping into the new record.</w:t>
+      </w:r>
+    </w:p>
+    <w:p>
+      <w:pPr>
+        <w:pStyle w:val="ListParagraph"/>
+        <w:numPr>
+          <w:ilvl w:val="0"/>
+          <w:numId w:val="2"/>
+        </w:numPr>
+        <w:spacing w:after="60"/>
+      </w:pPr>
+      <w:r>
+        <w:t xml:space="preserve">Participant photos and user profile photos — see sections 4 and 7.</w:t>
+      </w:r>
+    </w:p>
+    <w:p>
+      <w:pPr>
+        <w:spacing w:after="120"/>
+      </w:pPr>
+      <w:r>
+        <w:t xml:space="preserve">Deploying v0.3.9 requires two database migrations, both safe to re-run:</w:t>
+      </w:r>
+    </w:p>
+    <w:p>
+      <w:pPr>
+        <w:pStyle w:val="ListParagraph"/>
+        <w:numPr>
+          <w:ilvl w:val="0"/>
+          <w:numId w:val="2"/>
+        </w:numPr>
+        <w:spacing w:after="60"/>
+      </w:pPr>
+      <w:r>
+        <w:t xml:space="preserve">server/sql/migrations/v0.3.9a-participant-photo.sql — adds participants.has_photo.</w:t>
+      </w:r>
+    </w:p>
+    <w:p>
+      <w:pPr>
+        <w:pStyle w:val="ListParagraph"/>
+        <w:numPr>
+          <w:ilvl w:val="0"/>
+          <w:numId w:val="2"/>
+        </w:numPr>
+        <w:spacing w:after="60"/>
+      </w:pPr>
+      <w:r>
+        <w:t xml:space="preserve">server/sql/migrations/v0.3.9b-user-photo.sql — adds users.has_photo.</w:t>
+      </w:r>
+    </w:p>
+    <w:p>
+      <w:pPr>
+        <w:spacing w:after="120"/>
+      </w:pPr>
+      <w:r>
+        <w:t xml:space="preserve">Run each on the droplet with: sudo docker exec -i moodle-mariadb-1 mariadb -h127.0.0.1 -uubuntu_me -p'PASSWORD' ubuntu_me &lt; MIGRATION_FILE (quote the password if it contains special characters).</w:t>
+      </w:r>
     </w:p>
     <w:sectPr>
       <w:pgSz w:w="12240" w:h="15840"/>

</xml_diff>

<commit_message>
Update guides: trainer and admin (EN/FR), add Trainer Guide in Swahili and Arabic
Brings the guide documents on main in line with develop. Docs only: no app or server files change, so main still mirrors the v0.3.9 code in production. The Swahili and Arabic guides describe the interface languages that ship with v0.3.10.

Co-Authored-By: Claude Opus 5.5 <noreply@anthropic.com>
Claude-Session: https://claude.ai/code/session_01CMPS8Hgsnj1uYkD29XF28B
</commit_message>
<xml_diff>
--- a/docs/Admin-Guide-EN.docx
+++ b/docs/Admin-Guide-EN.docx
@@ -46,7 +46,7 @@
           <w:sz w:val="24"/>
           <w:szCs w:val="24"/>
         </w:rPr>
-        <w:t xml:space="preserve">Ubuntu 3.0 admin console — cohorts, courses, staff, Moodle, audit, demo data, donor portal</w:t>
+        <w:t xml:space="preserve">Ubuntu 3.0 admin console — academic years, courses, staff, Moodle, audit, demo data, donor portal</w:t>
       </w:r>
     </w:p>
     <w:p>
@@ -74,7 +74,7 @@
           <w:sz w:val="22"/>
           <w:szCs w:val="22"/>
         </w:rPr>
-        <w:t xml:space="preserve">Version: v0.3.8 (June 2026)</w:t>
+        <w:t xml:space="preserve">Version: v0.3.9 (July 2026)</w:t>
       </w:r>
     </w:p>
     <w:p>
@@ -121,7 +121,7 @@
         <w:spacing w:after="60"/>
       </w:pPr>
       <w:r>
-        <w:t xml:space="preserve">Create and manage cohorts, courses, and their facilitators.</w:t>
+        <w:t xml:space="preserve">Create and manage academic years, courses, and their facilitators.</w:t>
       </w:r>
     </w:p>
     <w:p>
@@ -309,15 +309,15 @@
         <w:pStyle w:val="Heading1"/>
       </w:pPr>
       <w:r>
-        <w:t xml:space="preserve">2. Cohorts</w:t>
-      </w:r>
-    </w:p>
-    <w:p>
-      <w:pPr>
-        <w:spacing w:after="120"/>
-      </w:pPr>
-      <w:r>
-        <w:t xml:space="preserve">A cohort is a time-bound batch of courses — e.g. 'MAHAMA 2025'. Every course belongs to a cohort.</w:t>
+        <w:t xml:space="preserve">2. Academic years</w:t>
+      </w:r>
+    </w:p>
+    <w:p>
+      <w:pPr>
+        <w:spacing w:after="120"/>
+      </w:pPr>
+      <w:r>
+        <w:t xml:space="preserve">An academic year is a time-bound batch of courses — e.g. 'MAHAMA 2025'. Every course belongs to an academic year.</w:t>
       </w:r>
     </w:p>
     <w:p>
@@ -325,20 +325,20 @@
         <w:pStyle w:val="Heading2"/>
       </w:pPr>
       <w:r>
-        <w:t xml:space="preserve">Create a cohort</w:t>
-      </w:r>
-    </w:p>
-    <w:p>
-      <w:pPr>
-        <w:pStyle w:val="ListParagraph"/>
-        <w:numPr>
-          <w:ilvl w:val="0"/>
-          <w:numId w:val="1"/>
-        </w:numPr>
-        <w:spacing w:after="60"/>
-      </w:pPr>
-      <w:r>
-        <w:t xml:space="preserve">Sidebar → Cohorts → '+ New cohort'.</w:t>
+        <w:t xml:space="preserve">Create an academic year</w:t>
+      </w:r>
+    </w:p>
+    <w:p>
+      <w:pPr>
+        <w:pStyle w:val="ListParagraph"/>
+        <w:numPr>
+          <w:ilvl w:val="0"/>
+          <w:numId w:val="1"/>
+        </w:numPr>
+        <w:spacing w:after="60"/>
+      </w:pPr>
+      <w:r>
+        <w:t xml:space="preserve">Sidebar → Academic years → '+ New academic year'.</w:t>
       </w:r>
     </w:p>
     <w:p>
@@ -430,7 +430,7 @@
           </w:p>
           <w:p>
             <w:r>
-              <w:t xml:space="preserve">When you delete a cohort, its courses, sessions and participants stay — only the link to the cohort goes away. No history is lost, and the sync ensures every device drops the link on its next pull.</w:t>
+              <w:t xml:space="preserve">When you delete an academic year, its courses, sessions and participants stay — only the link to the academic year goes away. No history is lost, and the sync ensures every device drops the link on its next pull.</w:t>
             </w:r>
           </w:p>
         </w:tc>
@@ -454,7 +454,7 @@
         <w:spacing w:after="120"/>
       </w:pPr>
       <w:r>
-        <w:t xml:space="preserve">A course is a training run by one or more staff members inside a cohort. The Courses table shows the thumbnail (Moodle banner if linked), name, cohort, facilitators, and an updated-at column.</w:t>
+        <w:t xml:space="preserve">A course is a training run by one or more staff members inside an academic year. The Courses table shows the thumbnail (Moodle banner if linked), name, academic year, facilitators, and an updated-at column.</w:t>
       </w:r>
     </w:p>
     <w:p>
@@ -488,7 +488,7 @@
         <w:spacing w:after="60"/>
       </w:pPr>
       <w:r>
-        <w:t xml:space="preserve">Pick a cohort (required).</w:t>
+        <w:t xml:space="preserve">Pick an academic year (required).</w:t>
       </w:r>
     </w:p>
     <w:p>
@@ -675,6 +675,14 @@
       </w:pPr>
       <w:r>
         <w:t xml:space="preserve">'Reactivate' (on already-dropped rows) puts them back. After reactivation, a 'Delete anyway' option appears in the PWA for cases where you really need to wipe the row and its history.</w:t>
+      </w:r>
+    </w:p>
+    <w:p>
+      <w:pPr>
+        <w:spacing w:after="120"/>
+      </w:pPr>
+      <w:r>
+        <w:t xml:space="preserve">New in v0.3.9: participants can carry a profile photo, captured in the PWA participant form. The bytes live on the server under /opt/ubuntu3/server/storage/participants/ and are served by /api/participants/{id}/media/photo. Avatars show in the PWA rosters and pickers; the admin console tables are unchanged.</w:t>
       </w:r>
     </w:p>
     <w:p>
@@ -1013,6 +1021,14 @@
     </w:p>
     <w:p>
       <w:pPr>
+        <w:spacing w:after="120"/>
+      </w:pPr>
+      <w:r>
+        <w:t xml:space="preserve">New in v0.3.9: every account (staff and trainee) can carry a profile photo (users.has_photo). Each person sets their own in the PWA under More → Profile; admins can manage anyone's via /api/users/{id}/media/photo. Files live under /opt/ubuntu3/server/storage/users/. Avatars appear in the facilitator picker and the participant picker.</w:t>
+      </w:r>
+    </w:p>
+    <w:p>
+      <w:pPr>
         <w:pStyle w:val="Heading1"/>
       </w:pPr>
       <w:r>
@@ -1024,7 +1040,7 @@
         <w:spacing w:after="120"/>
       </w:pPr>
       <w:r>
-        <w:t xml:space="preserve">Sidebar → Audit log. Shows 'who edited what, when' across cohorts, courses, sessions, participants, and stories. Derived from the existing author_id + server_updated_at / created_at / deleted_at columns — no extra schema.</w:t>
+        <w:t xml:space="preserve">Sidebar → Audit log. Shows 'who edited what, when' across academic years, courses, sessions, participants, and stories. Derived from the existing author_id + server_updated_at / created_at / deleted_at columns — no extra schema.</w:t>
       </w:r>
     </w:p>
     <w:p>
@@ -1045,7 +1061,7 @@
         <w:spacing w:after="60"/>
       </w:pPr>
       <w:r>
-        <w:t xml:space="preserve">Entity — cohorts / courses / sessions / participants / stories.</w:t>
+        <w:t xml:space="preserve">Entity — academic years / courses / sessions / participants / stories.</w:t>
       </w:r>
     </w:p>
     <w:p>
@@ -1166,7 +1182,7 @@
         <w:spacing w:after="120"/>
       </w:pPr>
       <w:r>
-        <w:t xml:space="preserve">On the admin Dashboard, near the bottom, the 'Sample data (trainer training)' card lets you create a self-contained DEMO cohort full of fake but realistic data so new trainers can practice in the PWA without touching the real M&amp;E corpus.</w:t>
+        <w:t xml:space="preserve">On the admin Dashboard, near the bottom, the 'Sample data (trainer training)' card lets you create a self-contained DEMO academic year full of fake but realistic data so new trainers can practice in the PWA without touching the real M&amp;E corpus.</w:t>
       </w:r>
     </w:p>
     <w:p>
@@ -1182,20 +1198,20 @@
         <w:spacing w:after="120"/>
       </w:pPr>
       <w:r>
-        <w:t xml:space="preserve">Click 'Create demo cohort'. The server seeds, in one transaction:</w:t>
-      </w:r>
-    </w:p>
-    <w:p>
-      <w:pPr>
-        <w:pStyle w:val="ListParagraph"/>
-        <w:numPr>
-          <w:ilvl w:val="0"/>
-          <w:numId w:val="2"/>
-        </w:numPr>
-        <w:spacing w:after="60"/>
-      </w:pPr>
-      <w:r>
-        <w:t xml:space="preserve">1 cohort named 'DEMO — Sandbox cohort' (region 'Demo region').</w:t>
+        <w:t xml:space="preserve">Click 'Create demo academic year'. The server seeds, in one transaction:</w:t>
+      </w:r>
+    </w:p>
+    <w:p>
+      <w:pPr>
+        <w:pStyle w:val="ListParagraph"/>
+        <w:numPr>
+          <w:ilvl w:val="0"/>
+          <w:numId w:val="2"/>
+        </w:numPr>
+        <w:spacing w:after="60"/>
+      </w:pPr>
+      <w:r>
+        <w:t xml:space="preserve">1 academic year named 'DEMO — Sandbox cohort' (region 'Demo region').</w:t>
       </w:r>
     </w:p>
     <w:p>
@@ -1268,7 +1284,7 @@
         <w:spacing w:after="120"/>
       </w:pPr>
       <w:r>
-        <w:t xml:space="preserve">The demo data syncs down to every trainer device on next pull. Two clicks are safe — the create endpoint is idempotent and returns the existing summary if a DEMO cohort is already present.</w:t>
+        <w:t xml:space="preserve">The demo data syncs down to every trainer device on next pull. Two clicks are safe — the create endpoint is idempotent and returns the existing summary if a DEMO academic year is already present.</w:t>
       </w:r>
     </w:p>
     <w:p>
@@ -1284,7 +1300,7 @@
         <w:spacing w:after="120"/>
       </w:pPr>
       <w:r>
-        <w:t xml:space="preserve">When the training is over, click 'Remove demo data'. The endpoint tombstones the whole subtree (attendance → stories → sessions → participants → courses → cohort) in a single transaction. Every device drops the rows on next sync.</w:t>
+        <w:t xml:space="preserve">When the training is over, click 'Remove demo data'. The endpoint tombstones the whole subtree (attendance → stories → sessions → participants → courses → academic year) in a single transaction. Every device drops the rows on next sync.</w:t>
       </w:r>
     </w:p>
     <w:tbl>
@@ -1334,7 +1350,7 @@
           </w:p>
           <w:p>
             <w:r>
-              <w:t xml:space="preserve">The demo tree is anchored entirely on the cohort name prefix 'DEMO — '. Don't rename it from the database directly — the cleanup endpoint and the donor portal exclude filter both stop recognising it. Edit it from the admin UI instead.</w:t>
+              <w:t xml:space="preserve">The demo tree is anchored entirely on the academic year name prefix 'DEMO — '. Don't rename it from the database directly — the cleanup endpoint and the donor portal exclude filter both stop recognising it. Edit it from the admin UI instead.</w:t>
             </w:r>
           </w:p>
         </w:tc>
@@ -1384,15 +1400,15 @@
         <w:spacing w:after="60"/>
       </w:pPr>
       <w:r>
-        <w:t xml:space="preserve">Cohort (optional — leave blank for all).</w:t>
-      </w:r>
-    </w:p>
-    <w:p>
-      <w:pPr>
-        <w:spacing w:after="120"/>
-      </w:pPr>
-      <w:r>
-        <w:t xml:space="preserve">The result page renders headline KPIs (attendance %, sessions delivered, participants, stories with consent), demographics by sex and age, per-cohort breakdown, attendance trend by month, and a card per selected story with text, photo and attribution. Use the browser's Print → Save as PDF to produce the document.</w:t>
+        <w:t xml:space="preserve">Academic year (optional — leave blank for all).</w:t>
+      </w:r>
+    </w:p>
+    <w:p>
+      <w:pPr>
+        <w:spacing w:after="120"/>
+      </w:pPr>
+      <w:r>
+        <w:t xml:space="preserve">The result page renders headline KPIs (attendance %, sessions delivered, participants, stories with consent), demographics by sex and age, per-academic-year breakdown, attendance trend by month, and a card per selected story with text, photo and attribution. Use the browser's Print → Save as PDF to produce the document.</w:t>
       </w:r>
     </w:p>
     <w:p>
@@ -1421,7 +1437,7 @@
         <w:spacing w:after="60"/>
       </w:pPr>
       <w:r>
-        <w:t xml:space="preserve">Active cohorts (had a session in the last 90 days), total cohorts, courses, participants, sessions (all-time + last 30 days), stories with consent.</w:t>
+        <w:t xml:space="preserve">Active academic years (had a session in the last 90 days), total academic years, courses, participants, sessions (all-time + last 30 days), stories with consent.</w:t>
       </w:r>
     </w:p>
     <w:p>
@@ -1473,7 +1489,7 @@
         <w:spacing w:after="60"/>
       </w:pPr>
       <w:r>
-        <w:t xml:space="preserve">Reach by region (cohorts + participants per region).</w:t>
+        <w:t xml:space="preserve">Reach by region (academic years + participants per region).</w:t>
       </w:r>
     </w:p>
     <w:p>
@@ -1494,7 +1510,7 @@
         <w:spacing w:after="120"/>
       </w:pPr>
       <w:r>
-        <w:t xml:space="preserve">The DEMO cohort and all soft-deleted rows are excluded by a single server-side filter. No PII is ever exposed.</w:t>
+        <w:t xml:space="preserve">The DEMO academic year and all soft-deleted rows are excluded by a single server-side filter. No PII is ever exposed.</w:t>
       </w:r>
     </w:p>
     <w:tbl>
@@ -1975,6 +1991,121 @@
       <w:pPr>
         <w:spacing w:after="80"/>
       </w:pPr>
+    </w:p>
+    <w:p>
+      <w:pPr>
+        <w:pStyle w:val="Heading1"/>
+      </w:pPr>
+      <w:r>
+        <w:t xml:space="preserve">New in v0.3.9 — what changed and how to deploy</w:t>
+      </w:r>
+    </w:p>
+    <w:p>
+      <w:pPr>
+        <w:pStyle w:val="ListParagraph"/>
+        <w:numPr>
+          <w:ilvl w:val="0"/>
+          <w:numId w:val="2"/>
+        </w:numPr>
+        <w:spacing w:after="60"/>
+      </w:pPr>
+      <w:r>
+        <w:t xml:space="preserve">'Cohorts' are now called 'Academic years' everywhere — PWA (all three languages) and admin console. Labels only; the data model, API, and CSV column ids are untouched.</w:t>
+      </w:r>
+    </w:p>
+    <w:p>
+      <w:pPr>
+        <w:pStyle w:val="ListParagraph"/>
+        <w:numPr>
+          <w:ilvl w:val="0"/>
+          <w:numId w:val="2"/>
+        </w:numPr>
+        <w:spacing w:after="60"/>
+      </w:pPr>
+      <w:r>
+        <w:t xml:space="preserve">Offline reliability: the PWA no longer trusts the browser's online flag. It simply attempts the sync, and also syncs every time it returns to the foreground. Records captured offline now reliably reach the server.</w:t>
+      </w:r>
+    </w:p>
+    <w:p>
+      <w:pPr>
+        <w:pStyle w:val="ListParagraph"/>
+        <w:numPr>
+          <w:ilvl w:val="0"/>
+          <w:numId w:val="2"/>
+        </w:numPr>
+        <w:spacing w:after="60"/>
+      </w:pPr>
+      <w:r>
+        <w:t xml:space="preserve">Every session page lists its linked stories, with a search bar and a "+" circle that pre-links a new story to the session.</w:t>
+      </w:r>
+    </w:p>
+    <w:p>
+      <w:pPr>
+        <w:pStyle w:val="ListParagraph"/>
+        <w:numPr>
+          <w:ilvl w:val="0"/>
+          <w:numId w:val="2"/>
+        </w:numPr>
+        <w:spacing w:after="60"/>
+      </w:pPr>
+      <w:r>
+        <w:t xml:space="preserve">Creating a course, session, or story returns to the list it came from (newest on top) instead of jumping into the new record.</w:t>
+      </w:r>
+    </w:p>
+    <w:p>
+      <w:pPr>
+        <w:pStyle w:val="ListParagraph"/>
+        <w:numPr>
+          <w:ilvl w:val="0"/>
+          <w:numId w:val="2"/>
+        </w:numPr>
+        <w:spacing w:after="60"/>
+      </w:pPr>
+      <w:r>
+        <w:t xml:space="preserve">Participant photos and user profile photos — see sections 4 and 7.</w:t>
+      </w:r>
+    </w:p>
+    <w:p>
+      <w:pPr>
+        <w:spacing w:after="120"/>
+      </w:pPr>
+      <w:r>
+        <w:t xml:space="preserve">Deploying v0.3.9 requires two database migrations, both safe to re-run:</w:t>
+      </w:r>
+    </w:p>
+    <w:p>
+      <w:pPr>
+        <w:pStyle w:val="ListParagraph"/>
+        <w:numPr>
+          <w:ilvl w:val="0"/>
+          <w:numId w:val="2"/>
+        </w:numPr>
+        <w:spacing w:after="60"/>
+      </w:pPr>
+      <w:r>
+        <w:t xml:space="preserve">server/sql/migrations/v0.3.9a-participant-photo.sql — adds participants.has_photo.</w:t>
+      </w:r>
+    </w:p>
+    <w:p>
+      <w:pPr>
+        <w:pStyle w:val="ListParagraph"/>
+        <w:numPr>
+          <w:ilvl w:val="0"/>
+          <w:numId w:val="2"/>
+        </w:numPr>
+        <w:spacing w:after="60"/>
+      </w:pPr>
+      <w:r>
+        <w:t xml:space="preserve">server/sql/migrations/v0.3.9b-user-photo.sql — adds users.has_photo.</w:t>
+      </w:r>
+    </w:p>
+    <w:p>
+      <w:pPr>
+        <w:spacing w:after="120"/>
+      </w:pPr>
+      <w:r>
+        <w:t xml:space="preserve">Run each on the droplet with: sudo docker exec -i moodle-mariadb-1 mariadb -h127.0.0.1 -uubuntu_me -p'PASSWORD' ubuntu_me &lt; MIGRATION_FILE (quote the password if it contains special characters).</w:t>
+      </w:r>
     </w:p>
     <w:sectPr>
       <w:pgSz w:w="12240" w:h="15840"/>

</xml_diff>